<commit_message>
Sincronizar el tablero con los hitos y cerrar INF-02
Un issue creado con --milestone entra al hito pero no al tablero de Projects.
Las diecisiete historias creadas despues de armarlo se quedaron fuera, asi
que el Sprint 1 mostraba cinco tarjetas cuando el hito ya tenia veintidos.

Ademas DOC-03 llevaba 5 puntos propios que se sumaban a los 46 de las ocho
hijas que agrupa: un paraguas no estima trabajo, lo agrupa. Queda en 0 y el
Sprint 1 cierra en 95 puntos, que es la cifra que ya declaraban el archivo de
contexto y el Avance 1.3.

INF-02 se cierra: los cinco integrantes ya ejecutan el proyecto desde VS Code.

Co-Authored-By: Claude Opus 5 <noreply@anthropic.com>
</commit_message>
<xml_diff>
--- a/Documentacion/Avance_Biblioteca_1.3.docx
+++ b/Documentacion/Avance_Biblioteca_1.3.docx
@@ -19952,7 +19952,7 @@
                 <w:sz w:val="19"/>
                 <w:szCs w:val="19"/>
               </w:rPr>
-              <w:t xml:space="preserve">0 de 22</w:t>
+              <w:t xml:space="preserve">1 de 22</w:t>
             </w:r>
           </w:p>
         </w:tc>
@@ -19975,7 +19975,7 @@
                 <w:sz w:val="19"/>
                 <w:szCs w:val="19"/>
               </w:rPr>
-              <w:t xml:space="preserve">0 de 95</w:t>
+              <w:t xml:space="preserve">2 de 95</w:t>
             </w:r>
           </w:p>
         </w:tc>
@@ -20328,7 +20328,7 @@
                 <w:sz w:val="19"/>
                 <w:szCs w:val="19"/>
               </w:rPr>
-              <w:t xml:space="preserve">27 de 60</w:t>
+              <w:t xml:space="preserve">28 de 60</w:t>
             </w:r>
           </w:p>
         </w:tc>
@@ -20351,7 +20351,7 @@
                 <w:sz w:val="19"/>
                 <w:szCs w:val="19"/>
               </w:rPr>
-              <w:t xml:space="preserve">111 de 261</w:t>
+              <w:t xml:space="preserve">113 de 261</w:t>
             </w:r>
           </w:p>
         </w:tc>
@@ -20449,7 +20449,7 @@
           <w:sz w:val="22"/>
           <w:szCs w:val="22"/>
         </w:rPr>
-        <w:t xml:space="preserve">De las 33 historias abiertas, veintidós pertenecen al Sprint 1: los ocho entregables gráficos, la documentación pendiente y las ocho peticiones de la escuela. El resto corresponde a funcionalidad que el sistema Java nunca tuvo:</w:t>
+        <w:t xml:space="preserve">De las 32 historias abiertas, veintiuna pertenecen al Sprint 1: los ocho entregables gráficos, la documentación pendiente y las ocho peticiones de la escuela. El resto corresponde a funcionalidad que el sistema Java nunca tuvo:</w:t>
       </w:r>
     </w:p>
     <w:p>

</xml_diff>